<commit_message>
feat : Add SweetAlert2 notifications and remove admin buttons
Integrate SweetAlert2 library into app layout to display success, error, and validation error messages with improved UX. Remove edit and delete admin buttons from the pengumuman show page. Also fixes CSS formatting in box-shadow.
</commit_message>
<xml_diff>
--- a/PROPOSAL PENGEMBANGAN APLIKASI.docx
+++ b/PROPOSAL PENGEMBANGAN APLIKASI.docx
@@ -59,28 +59,140 @@
     </w:p>
     <w:p>
       <w:pPr>
-        <w:rPr>
-          <w:lang w:val="id-ID"/>
-        </w:rPr>
-      </w:pPr>
-      <w:r>
-        <w:rPr>
-          <w:lang w:val="id-ID"/>
-        </w:rPr>
-        <w:t>Perkembangan teknologi informasi telah mendorong transformasi digital dalam berbagai bidang, termasuk pendidikan dan pelatihan. Lembaga kursus dituntut untuk menyediakan layanan yang lebih efektif, efisien, dan mudah diakses oleh masyarakat. Oleh karena itu, diperlukan sebuah sistem informasi berbasis web yang mampu mengelola proses administrasi kursus secara terintegrasi.</w:t>
-      </w:r>
-    </w:p>
-    <w:p>
-      <w:pPr>
-        <w:rPr>
-          <w:lang w:val="id-ID"/>
-        </w:rPr>
-      </w:pPr>
-      <w:r>
-        <w:rPr>
-          <w:lang w:val="id-ID"/>
-        </w:rPr>
-        <w:t>Sistem Informasi Kursus Online "Meteor Garden" dikembangkan sebagai solusi untuk mendukung proses pendaftaran peserta, pemilihan kelas, konfirmasi pembayaran, serta penyampaian informasi secara digital. Dengan adanya sistem ini, proses administrasi menjadi lebih cepat, akurat, dan mudah dikelola baik oleh peserta maupun administrator.</w:t>
+        <w:ind w:firstLine="426"/>
+        <w:rPr>
+          <w:lang w:val="id-ID"/>
+        </w:rPr>
+      </w:pPr>
+      <w:r>
+        <w:rPr>
+          <w:lang w:val="id-ID"/>
+        </w:rPr>
+        <w:t>Lembaga kursus "Meteor Garden" saat ini mengelola proses administrasi menggunakan aplikasi desktop berbasis Visual Basic yang telah beroperasi selama bertahun-tahun. Aplikasi ini masih digunakan oleh staf administrasi untuk pencatatan pendaftaran dan jadwal kelas. Namun demikian, aplikasi desktop tersebut menghadapi beberapa kendala yang signifikan.</w:t>
+      </w:r>
+    </w:p>
+    <w:p>
+      <w:pPr>
+        <w:ind w:firstLine="426"/>
+        <w:rPr>
+          <w:lang w:val="id-ID"/>
+        </w:rPr>
+      </w:pPr>
+      <w:r>
+        <w:rPr>
+          <w:lang w:val="id-ID"/>
+        </w:rPr>
+        <w:t xml:space="preserve">Pertama, aplikasi berbasis Visual Basic tidak memungkinkan untuk dikembangkan lebih lanjut karena keterbatasan teknologi dan </w:t>
+      </w:r>
+      <w:proofErr w:type="spellStart"/>
+      <w:r>
+        <w:rPr>
+          <w:i/>
+          <w:iCs/>
+          <w:lang w:val="id-ID"/>
+        </w:rPr>
+        <w:t>library</w:t>
+      </w:r>
+      <w:proofErr w:type="spellEnd"/>
+      <w:r>
+        <w:rPr>
+          <w:lang w:val="id-ID"/>
+        </w:rPr>
+        <w:t xml:space="preserve"> yang sudah usang. Kedua, tidak adanya dokumentasi teknis yang memadai menyulitkan proses pemeliharaan dan pengembangan fitur baru. Ketiga, aplikasi hanya dapat diakses secara lokal oleh staf administrasi, sehingga calon peserta tidak dapat melakukan pendaftaran secara mandiri. Keempat, server yang digunakan saat ini adalah </w:t>
+      </w:r>
+      <w:r>
+        <w:rPr>
+          <w:i/>
+          <w:iCs/>
+          <w:lang w:val="id-ID"/>
+        </w:rPr>
+        <w:t>Windows Server 2003</w:t>
+      </w:r>
+      <w:r>
+        <w:rPr>
+          <w:lang w:val="id-ID"/>
+        </w:rPr>
+        <w:t xml:space="preserve"> dengan spesifikasi </w:t>
+      </w:r>
+      <w:r>
+        <w:rPr>
+          <w:i/>
+          <w:iCs/>
+          <w:lang w:val="id-ID"/>
+        </w:rPr>
+        <w:t xml:space="preserve">Intel </w:t>
+      </w:r>
+      <w:proofErr w:type="spellStart"/>
+      <w:r>
+        <w:rPr>
+          <w:i/>
+          <w:iCs/>
+          <w:lang w:val="id-ID"/>
+        </w:rPr>
+        <w:t>Pentium</w:t>
+      </w:r>
+      <w:proofErr w:type="spellEnd"/>
+      <w:r>
+        <w:rPr>
+          <w:lang w:val="id-ID"/>
+        </w:rPr>
+        <w:t xml:space="preserve"> 4, RAM 2GB, dan HDD 250GB yang sudah sangat usang dan rentan terhadap ancaman keamanan.</w:t>
+      </w:r>
+    </w:p>
+    <w:p>
+      <w:pPr>
+        <w:ind w:firstLine="426"/>
+        <w:rPr>
+          <w:lang w:val="id-ID"/>
+        </w:rPr>
+      </w:pPr>
+      <w:r>
+        <w:rPr>
+          <w:lang w:val="id-ID"/>
+        </w:rPr>
+        <w:t xml:space="preserve">Perkembangan teknologi informasi mendorong transformasi digital dalam berbagai bidang, termasuk pendidikan dan pelatihan. Lembaga kursus dituntut untuk menyediakan layanan yang lebih efektif, efisien, dan mudah diakses oleh masyarakat. Oleh karena itu, diperlukan migrasi ke sistem informasi berbasis web yang modern, aman, dan dapat diakses secara </w:t>
+      </w:r>
+      <w:proofErr w:type="spellStart"/>
+      <w:r>
+        <w:rPr>
+          <w:lang w:val="id-ID"/>
+        </w:rPr>
+        <w:t>online</w:t>
+      </w:r>
+      <w:proofErr w:type="spellEnd"/>
+      <w:r>
+        <w:rPr>
+          <w:lang w:val="id-ID"/>
+        </w:rPr>
+        <w:t>.</w:t>
+      </w:r>
+    </w:p>
+    <w:p>
+      <w:pPr>
+        <w:ind w:firstLine="426"/>
+        <w:rPr>
+          <w:lang w:val="id-ID"/>
+        </w:rPr>
+      </w:pPr>
+      <w:r>
+        <w:rPr>
+          <w:lang w:val="id-ID"/>
+        </w:rPr>
+        <w:t xml:space="preserve">Sistem Informasi Kursus Online "Meteor Garden" dikembangkan sebagai solusi untuk menggantikan aplikasi desktop yang sudah usang dengan sistem berbasis web. Sistem ini akan mendukung proses pendaftaran peserta secara </w:t>
+      </w:r>
+      <w:proofErr w:type="spellStart"/>
+      <w:r>
+        <w:rPr>
+          <w:lang w:val="id-ID"/>
+        </w:rPr>
+        <w:t>online</w:t>
+      </w:r>
+      <w:proofErr w:type="spellEnd"/>
+      <w:r>
+        <w:rPr>
+          <w:lang w:val="id-ID"/>
+        </w:rPr>
+        <w:t>, pengelolaan kelas dan pembayaran, penyampaian informasi secara digital, serta dapat diakses selama 24 jam dengan tingkat keamanan yang terjamin.</w:t>
       </w:r>
     </w:p>
     <w:p>
@@ -98,87 +210,150 @@
     </w:p>
     <w:p>
       <w:pPr>
-        <w:rPr>
-          <w:lang w:val="id-ID"/>
-        </w:rPr>
-      </w:pPr>
-      <w:r>
-        <w:rPr>
-          <w:lang w:val="id-ID"/>
-        </w:rPr>
-        <w:t>Tujuan pengembangan aplikasi ini adalah:</w:t>
-      </w:r>
-    </w:p>
-    <w:p>
-      <w:pPr>
-        <w:pStyle w:val="ListParagraph"/>
-        <w:numPr>
-          <w:ilvl w:val="0"/>
-          <w:numId w:val="1"/>
-        </w:numPr>
-        <w:rPr>
-          <w:lang w:val="id-ID"/>
-        </w:rPr>
-      </w:pPr>
-      <w:r>
-        <w:rPr>
-          <w:lang w:val="id-ID"/>
-        </w:rPr>
-        <w:t>Mengembangkan sistem informasi kursus berbasis web.</w:t>
-      </w:r>
-    </w:p>
-    <w:p>
-      <w:pPr>
-        <w:pStyle w:val="ListParagraph"/>
-        <w:numPr>
-          <w:ilvl w:val="0"/>
-          <w:numId w:val="1"/>
-        </w:numPr>
-        <w:rPr>
-          <w:lang w:val="id-ID"/>
-        </w:rPr>
-      </w:pPr>
-      <w:r>
-        <w:rPr>
-          <w:lang w:val="id-ID"/>
-        </w:rPr>
-        <w:t>Mempermudah proses administrasi peserta dan administrator.</w:t>
-      </w:r>
-    </w:p>
-    <w:p>
-      <w:pPr>
-        <w:pStyle w:val="ListParagraph"/>
-        <w:numPr>
-          <w:ilvl w:val="0"/>
-          <w:numId w:val="1"/>
-        </w:numPr>
-        <w:rPr>
-          <w:lang w:val="id-ID"/>
-        </w:rPr>
-      </w:pPr>
-      <w:r>
-        <w:rPr>
-          <w:lang w:val="id-ID"/>
-        </w:rPr>
-        <w:t>Meningkatkan efisiensi pengelolaan data kursus.</w:t>
-      </w:r>
-    </w:p>
-    <w:p>
-      <w:pPr>
-        <w:pStyle w:val="ListParagraph"/>
-        <w:numPr>
-          <w:ilvl w:val="0"/>
-          <w:numId w:val="1"/>
-        </w:numPr>
-        <w:rPr>
-          <w:lang w:val="id-ID"/>
-        </w:rPr>
-      </w:pPr>
-      <w:r>
-        <w:rPr>
-          <w:lang w:val="id-ID"/>
-        </w:rPr>
-        <w:t>Menyediakan sistem yang aman, mudah digunakan, dan siap dikembangkan.</w:t>
+        <w:ind w:firstLine="426"/>
+        <w:rPr>
+          <w:lang w:val="id-ID"/>
+        </w:rPr>
+      </w:pPr>
+      <w:r>
+        <w:rPr>
+          <w:lang w:val="id-ID"/>
+        </w:rPr>
+        <w:t xml:space="preserve">Tujuan pengembangan aplikasi ini adalah mengganti aplikasi desktop Visual Basic dengan sistem informasi kursus berbasis web modern menggunakan </w:t>
+      </w:r>
+      <w:proofErr w:type="spellStart"/>
+      <w:r>
+        <w:rPr>
+          <w:i/>
+          <w:iCs/>
+          <w:lang w:val="id-ID"/>
+        </w:rPr>
+        <w:t>framework</w:t>
+      </w:r>
+      <w:proofErr w:type="spellEnd"/>
+      <w:r>
+        <w:rPr>
+          <w:i/>
+          <w:iCs/>
+          <w:lang w:val="id-ID"/>
+        </w:rPr>
+        <w:t xml:space="preserve"> </w:t>
+      </w:r>
+      <w:proofErr w:type="spellStart"/>
+      <w:r>
+        <w:rPr>
+          <w:i/>
+          <w:iCs/>
+          <w:lang w:val="id-ID"/>
+        </w:rPr>
+        <w:t>Laravel</w:t>
+      </w:r>
+      <w:proofErr w:type="spellEnd"/>
+      <w:r>
+        <w:rPr>
+          <w:lang w:val="id-ID"/>
+        </w:rPr>
+        <w:t xml:space="preserve">. Sistem ini harus dapat diakses secara </w:t>
+      </w:r>
+      <w:proofErr w:type="spellStart"/>
+      <w:r>
+        <w:rPr>
+          <w:lang w:val="id-ID"/>
+        </w:rPr>
+        <w:t>online</w:t>
+      </w:r>
+      <w:proofErr w:type="spellEnd"/>
+      <w:r>
+        <w:rPr>
+          <w:lang w:val="id-ID"/>
+        </w:rPr>
+        <w:t xml:space="preserve"> selama 24 jam penuh, tahan terhadap berbagai serangan siber dengan menerapkan praktik keamanan terbaik, serta mampu melayani pengguna dalam skala besar dengan arsitektur yang </w:t>
+      </w:r>
+      <w:proofErr w:type="spellStart"/>
+      <w:r>
+        <w:rPr>
+          <w:i/>
+          <w:iCs/>
+          <w:lang w:val="id-ID"/>
+        </w:rPr>
+        <w:t>scalable</w:t>
+      </w:r>
+      <w:proofErr w:type="spellEnd"/>
+      <w:r>
+        <w:rPr>
+          <w:lang w:val="id-ID"/>
+        </w:rPr>
+        <w:t>. Selain itu, sistem ini bertujuan mempermudah proses administrasi peserta dan administrator melalui antarmuka yang intuitif serta memberikan kemampuan kepada calon peserta untuk melakukan registrasi, pendaftaran kelas, dan pembayaran secara mandiri.</w:t>
+      </w:r>
+    </w:p>
+    <w:p>
+      <w:pPr>
+        <w:rPr>
+          <w:lang w:val="id-ID"/>
+        </w:rPr>
+      </w:pPr>
+      <w:r>
+        <w:rPr>
+          <w:lang w:val="id-ID"/>
+        </w:rPr>
+        <w:t>1.3 Manfaat</w:t>
+      </w:r>
+    </w:p>
+    <w:p>
+      <w:pPr>
+        <w:ind w:firstLine="426"/>
+        <w:rPr>
+          <w:lang w:val="id-ID"/>
+        </w:rPr>
+      </w:pPr>
+      <w:r>
+        <w:rPr>
+          <w:lang w:val="id-ID"/>
+        </w:rPr>
+        <w:t>Bagi lembaga kursus, sistem ini akan meningkatkan efisiensi operasional administrasi, mengurangi beban kerja staf administrasi, mempercepat proses pendaftaran dan verifikasi, serta meningkatkan profesionalisme layanan. Bagi calon peserta, sistem ini memberikan kemudahan akses informasi kursus, proses pendaftaran yang cepat dan mudah, pemantauan status pendaftaran secara real-</w:t>
+      </w:r>
+      <w:proofErr w:type="spellStart"/>
+      <w:r>
+        <w:rPr>
+          <w:lang w:val="id-ID"/>
+        </w:rPr>
+        <w:t>time</w:t>
+      </w:r>
+      <w:proofErr w:type="spellEnd"/>
+      <w:r>
+        <w:rPr>
+          <w:lang w:val="id-ID"/>
+        </w:rPr>
+        <w:t xml:space="preserve">, serta transparansi informasi pembayaran. Bagi administrator, sistem ini menyediakan pengelolaan data terpusat dan terintegrasi, </w:t>
+      </w:r>
+      <w:proofErr w:type="spellStart"/>
+      <w:r>
+        <w:rPr>
+          <w:lang w:val="id-ID"/>
+        </w:rPr>
+        <w:lastRenderedPageBreak/>
+        <w:t>dashboard</w:t>
+      </w:r>
+      <w:proofErr w:type="spellEnd"/>
+      <w:r>
+        <w:rPr>
+          <w:lang w:val="id-ID"/>
+        </w:rPr>
+        <w:t xml:space="preserve"> </w:t>
+      </w:r>
+      <w:proofErr w:type="spellStart"/>
+      <w:r>
+        <w:rPr>
+          <w:lang w:val="id-ID"/>
+        </w:rPr>
+        <w:t>monitoring</w:t>
+      </w:r>
+      <w:proofErr w:type="spellEnd"/>
+      <w:r>
+        <w:rPr>
+          <w:lang w:val="id-ID"/>
+        </w:rPr>
+        <w:t xml:space="preserve"> yang informatif, proses verifikasi yang efisien, serta kemudahan dalam mengelola pengumuman.</w:t>
       </w:r>
     </w:p>
     <w:p>
@@ -205,55 +380,83 @@
         <w:rPr>
           <w:lang w:val="id-ID"/>
         </w:rPr>
-        <w:t>Sistem Informasi Kursus Online "Meteor Garden" merupakan aplikasi berbasis web yang memiliki dua jenis pengguna, yaitu:</w:t>
-      </w:r>
-    </w:p>
-    <w:p>
-      <w:pPr>
-        <w:rPr>
-          <w:b/>
-          <w:bCs/>
-          <w:lang w:val="id-ID"/>
-        </w:rPr>
-      </w:pPr>
-      <w:r>
-        <w:rPr>
-          <w:b/>
-          <w:bCs/>
-          <w:lang w:val="id-ID"/>
-        </w:rPr>
-        <w:t>Calon Peserta</w:t>
-      </w:r>
-    </w:p>
-    <w:p>
-      <w:pPr>
-        <w:rPr>
-          <w:lang w:val="id-ID"/>
-        </w:rPr>
-      </w:pPr>
-      <w:r>
-        <w:rPr>
-          <w:lang w:val="id-ID"/>
-        </w:rPr>
-        <w:t>Calon peserta dapat:</w:t>
-      </w:r>
-    </w:p>
-    <w:p>
-      <w:pPr>
-        <w:pStyle w:val="ListParagraph"/>
-        <w:numPr>
-          <w:ilvl w:val="0"/>
-          <w:numId w:val="2"/>
-        </w:numPr>
-        <w:rPr>
-          <w:lang w:val="id-ID"/>
-        </w:rPr>
-      </w:pPr>
-      <w:r>
-        <w:rPr>
-          <w:lang w:val="id-ID"/>
-        </w:rPr>
-        <w:t xml:space="preserve">Melakukan registrasi dan </w:t>
+        <w:t>2.1 Gambaran Umum Sistem</w:t>
+      </w:r>
+    </w:p>
+    <w:p>
+      <w:pPr>
+        <w:ind w:firstLine="426"/>
+        <w:rPr>
+          <w:lang w:val="id-ID"/>
+        </w:rPr>
+      </w:pPr>
+      <w:r>
+        <w:rPr>
+          <w:lang w:val="id-ID"/>
+        </w:rPr>
+        <w:t xml:space="preserve">Sistem Informasi Kursus Online "Meteor Garden" merupakan aplikasi berbasis web yang dibangun menggunakan </w:t>
+      </w:r>
+      <w:proofErr w:type="spellStart"/>
+      <w:r>
+        <w:rPr>
+          <w:i/>
+          <w:iCs/>
+          <w:lang w:val="id-ID"/>
+        </w:rPr>
+        <w:t>framework</w:t>
+      </w:r>
+      <w:proofErr w:type="spellEnd"/>
+      <w:r>
+        <w:rPr>
+          <w:i/>
+          <w:iCs/>
+          <w:lang w:val="id-ID"/>
+        </w:rPr>
+        <w:t xml:space="preserve"> </w:t>
+      </w:r>
+      <w:proofErr w:type="spellStart"/>
+      <w:r>
+        <w:rPr>
+          <w:i/>
+          <w:iCs/>
+          <w:lang w:val="id-ID"/>
+        </w:rPr>
+        <w:t>Laravel</w:t>
+      </w:r>
+      <w:proofErr w:type="spellEnd"/>
+      <w:r>
+        <w:rPr>
+          <w:lang w:val="id-ID"/>
+        </w:rPr>
+        <w:t xml:space="preserve"> untuk menggantikan aplikasi desktop Visual Basic yang sudah usang. Sistem ini dirancang dengan arsitektur modern yang mendukung akses simultan dari banyak pengguna, keamanan tingkat tinggi, dan </w:t>
+      </w:r>
+      <w:proofErr w:type="spellStart"/>
+      <w:r>
+        <w:rPr>
+          <w:lang w:val="id-ID"/>
+        </w:rPr>
+        <w:t>skalabilitas</w:t>
+      </w:r>
+      <w:proofErr w:type="spellEnd"/>
+      <w:r>
+        <w:rPr>
+          <w:lang w:val="id-ID"/>
+        </w:rPr>
+        <w:t xml:space="preserve"> untuk pertumbuhan di masa depan. Sistem ini memiliki dua jenis pengguna dengan hak akses berbeda, yaitu calon peserta dan administrator.</w:t>
+      </w:r>
+    </w:p>
+    <w:p>
+      <w:pPr>
+        <w:ind w:firstLine="426"/>
+        <w:rPr>
+          <w:lang w:val="id-ID"/>
+        </w:rPr>
+      </w:pPr>
+      <w:r>
+        <w:rPr>
+          <w:lang w:val="id-ID"/>
+        </w:rPr>
+        <w:t xml:space="preserve">Calon peserta dapat mengakses sistem tanpa perlu </w:t>
       </w:r>
       <w:proofErr w:type="spellStart"/>
       <w:r>
@@ -267,225 +470,124 @@
         <w:rPr>
           <w:lang w:val="id-ID"/>
         </w:rPr>
+        <w:t xml:space="preserve"> terlebih dahulu untuk melihat status verifikasi akun. Setelah registrasi, peserta dapat melakukan </w:t>
+      </w:r>
+      <w:proofErr w:type="spellStart"/>
+      <w:r>
+        <w:rPr>
+          <w:lang w:val="id-ID"/>
+        </w:rPr>
+        <w:t>login</w:t>
+      </w:r>
+      <w:proofErr w:type="spellEnd"/>
+      <w:r>
+        <w:rPr>
+          <w:lang w:val="id-ID"/>
+        </w:rPr>
+        <w:t>, mendaftar ke kelas kursus yang tersedia, mengunggah bukti pembayaran, serta melihat informasi kursus dan pengumuman.</w:t>
+      </w:r>
+    </w:p>
+    <w:p>
+      <w:pPr>
+        <w:ind w:firstLine="426"/>
+        <w:rPr>
+          <w:lang w:val="id-ID"/>
+        </w:rPr>
+      </w:pPr>
+      <w:r>
+        <w:rPr>
+          <w:lang w:val="id-ID"/>
+        </w:rPr>
+        <w:t xml:space="preserve">Administrator memiliki hak akses penuh untuk mengelola sistem, meliputi </w:t>
+      </w:r>
+      <w:proofErr w:type="spellStart"/>
+      <w:r>
+        <w:rPr>
+          <w:lang w:val="id-ID"/>
+        </w:rPr>
+        <w:t>login</w:t>
+      </w:r>
+      <w:proofErr w:type="spellEnd"/>
+      <w:r>
+        <w:rPr>
+          <w:lang w:val="id-ID"/>
+        </w:rPr>
+        <w:t xml:space="preserve"> ke </w:t>
+      </w:r>
+      <w:proofErr w:type="spellStart"/>
+      <w:r>
+        <w:rPr>
+          <w:lang w:val="id-ID"/>
+        </w:rPr>
+        <w:t>dashboard</w:t>
+      </w:r>
+      <w:proofErr w:type="spellEnd"/>
+      <w:r>
+        <w:rPr>
+          <w:lang w:val="id-ID"/>
+        </w:rPr>
+        <w:t xml:space="preserve"> admin, memverifikasi akun peserta baru, memverifikasi pendaftaran kelas, memverifikasi pembayaran peserta, mengelola pengumuman, mengelola data kelas kursus, melihat laporan dan statistik, serta mengelola pengguna sistem.</w:t>
+      </w:r>
+    </w:p>
+    <w:p>
+      <w:pPr>
+        <w:rPr>
+          <w:lang w:val="id-ID"/>
+        </w:rPr>
+      </w:pPr>
+      <w:r>
+        <w:rPr>
+          <w:lang w:val="id-ID"/>
+        </w:rPr>
+        <w:t>2.2 Alur Sistem</w:t>
+      </w:r>
+    </w:p>
+    <w:p>
+      <w:pPr>
+        <w:ind w:firstLine="426"/>
+        <w:rPr>
+          <w:lang w:val="id-ID"/>
+        </w:rPr>
+      </w:pPr>
+      <w:r>
+        <w:rPr>
+          <w:lang w:val="id-ID"/>
+        </w:rPr>
+        <w:t xml:space="preserve">Alur pendaftaran peserta dimulai ketika calon peserta membuka </w:t>
+      </w:r>
+      <w:proofErr w:type="spellStart"/>
+      <w:r>
+        <w:rPr>
+          <w:lang w:val="id-ID"/>
+        </w:rPr>
+        <w:t>website</w:t>
+      </w:r>
+      <w:proofErr w:type="spellEnd"/>
+      <w:r>
+        <w:rPr>
+          <w:lang w:val="id-ID"/>
+        </w:rPr>
+        <w:t xml:space="preserve">. Calon peserta kemudian melakukan registrasi dengan mengisi data diri. Sistem akan mengirim notifikasi kepada admin untuk verifikasi akun. Setelah admin memverifikasi akun, peserta dapat </w:t>
+      </w:r>
+      <w:proofErr w:type="spellStart"/>
+      <w:r>
+        <w:rPr>
+          <w:lang w:val="id-ID"/>
+        </w:rPr>
+        <w:t>login</w:t>
+      </w:r>
+      <w:proofErr w:type="spellEnd"/>
+      <w:r>
+        <w:rPr>
+          <w:lang w:val="id-ID"/>
+        </w:rPr>
+        <w:t xml:space="preserve"> ke sistem dan memilih kelas yang diinginkan untuk melakukan pendaftaran. Sistem mencatat pendaftaran dan menunggu verifikasi dari admin. Admin memverifikasi pendaftaran kelas, kemudian peserta mengunggah bukti pembayaran. Setelah admin memverifikasi pembayaran, status peserta menjadi "Terdaftar" dan peserta dapat mengikuti kursus</w:t>
+      </w:r>
+      <w:r>
+        <w:rPr>
+          <w:lang w:val="id-ID"/>
+        </w:rPr>
         <w:t>.</w:t>
-      </w:r>
-    </w:p>
-    <w:p>
-      <w:pPr>
-        <w:pStyle w:val="ListParagraph"/>
-        <w:numPr>
-          <w:ilvl w:val="0"/>
-          <w:numId w:val="2"/>
-        </w:numPr>
-        <w:rPr>
-          <w:lang w:val="id-ID"/>
-        </w:rPr>
-      </w:pPr>
-      <w:r>
-        <w:rPr>
-          <w:lang w:val="id-ID"/>
-        </w:rPr>
-        <w:t>Melihat status verifikasi akun.</w:t>
-      </w:r>
-    </w:p>
-    <w:p>
-      <w:pPr>
-        <w:pStyle w:val="ListParagraph"/>
-        <w:numPr>
-          <w:ilvl w:val="0"/>
-          <w:numId w:val="2"/>
-        </w:numPr>
-        <w:rPr>
-          <w:lang w:val="id-ID"/>
-        </w:rPr>
-      </w:pPr>
-      <w:r>
-        <w:rPr>
-          <w:lang w:val="id-ID"/>
-        </w:rPr>
-        <w:t>Mendaftar kelas kursus.</w:t>
-      </w:r>
-    </w:p>
-    <w:p>
-      <w:pPr>
-        <w:pStyle w:val="ListParagraph"/>
-        <w:numPr>
-          <w:ilvl w:val="0"/>
-          <w:numId w:val="2"/>
-        </w:numPr>
-        <w:rPr>
-          <w:lang w:val="id-ID"/>
-        </w:rPr>
-      </w:pPr>
-      <w:r>
-        <w:rPr>
-          <w:lang w:val="id-ID"/>
-        </w:rPr>
-        <w:t>Mengunggah bukti pembayaran.</w:t>
-      </w:r>
-    </w:p>
-    <w:p>
-      <w:pPr>
-        <w:pStyle w:val="ListParagraph"/>
-        <w:numPr>
-          <w:ilvl w:val="0"/>
-          <w:numId w:val="2"/>
-        </w:numPr>
-        <w:rPr>
-          <w:lang w:val="id-ID"/>
-        </w:rPr>
-      </w:pPr>
-      <w:r>
-        <w:rPr>
-          <w:lang w:val="id-ID"/>
-        </w:rPr>
-        <w:t>Melihat informasi dan pengumuman.</w:t>
-      </w:r>
-    </w:p>
-    <w:p>
-      <w:pPr>
-        <w:rPr>
-          <w:b/>
-          <w:bCs/>
-          <w:lang w:val="id-ID"/>
-        </w:rPr>
-      </w:pPr>
-      <w:r>
-        <w:rPr>
-          <w:b/>
-          <w:bCs/>
-          <w:lang w:val="id-ID"/>
-        </w:rPr>
-        <w:t>Administrator</w:t>
-      </w:r>
-    </w:p>
-    <w:p>
-      <w:pPr>
-        <w:rPr>
-          <w:lang w:val="id-ID"/>
-        </w:rPr>
-      </w:pPr>
-      <w:r>
-        <w:rPr>
-          <w:lang w:val="id-ID"/>
-        </w:rPr>
-        <w:t>Administrator memiliki hak akses untuk:</w:t>
-      </w:r>
-    </w:p>
-    <w:p>
-      <w:pPr>
-        <w:pStyle w:val="ListParagraph"/>
-        <w:numPr>
-          <w:ilvl w:val="0"/>
-          <w:numId w:val="3"/>
-        </w:numPr>
-        <w:rPr>
-          <w:lang w:val="id-ID"/>
-        </w:rPr>
-      </w:pPr>
-      <w:proofErr w:type="spellStart"/>
-      <w:r>
-        <w:rPr>
-          <w:i/>
-          <w:iCs/>
-          <w:lang w:val="id-ID"/>
-        </w:rPr>
-        <w:t>Login</w:t>
-      </w:r>
-      <w:proofErr w:type="spellEnd"/>
-      <w:r>
-        <w:rPr>
-          <w:lang w:val="id-ID"/>
-        </w:rPr>
-        <w:t xml:space="preserve"> ke </w:t>
-      </w:r>
-      <w:proofErr w:type="spellStart"/>
-      <w:r>
-        <w:rPr>
-          <w:i/>
-          <w:iCs/>
-          <w:lang w:val="id-ID"/>
-        </w:rPr>
-        <w:t>dashboard</w:t>
-      </w:r>
-      <w:proofErr w:type="spellEnd"/>
-      <w:r>
-        <w:rPr>
-          <w:lang w:val="id-ID"/>
-        </w:rPr>
-        <w:t xml:space="preserve"> admin.</w:t>
-      </w:r>
-    </w:p>
-    <w:p>
-      <w:pPr>
-        <w:pStyle w:val="ListParagraph"/>
-        <w:numPr>
-          <w:ilvl w:val="0"/>
-          <w:numId w:val="3"/>
-        </w:numPr>
-        <w:rPr>
-          <w:lang w:val="id-ID"/>
-        </w:rPr>
-      </w:pPr>
-      <w:r>
-        <w:rPr>
-          <w:lang w:val="id-ID"/>
-        </w:rPr>
-        <w:t>Memverifikasi akun peserta.</w:t>
-      </w:r>
-    </w:p>
-    <w:p>
-      <w:pPr>
-        <w:pStyle w:val="ListParagraph"/>
-        <w:numPr>
-          <w:ilvl w:val="0"/>
-          <w:numId w:val="3"/>
-        </w:numPr>
-        <w:rPr>
-          <w:lang w:val="id-ID"/>
-        </w:rPr>
-      </w:pPr>
-      <w:r>
-        <w:rPr>
-          <w:lang w:val="id-ID"/>
-        </w:rPr>
-        <w:t>Memverifikasi pendaftaran kelas.</w:t>
-      </w:r>
-    </w:p>
-    <w:p>
-      <w:pPr>
-        <w:pStyle w:val="ListParagraph"/>
-        <w:numPr>
-          <w:ilvl w:val="0"/>
-          <w:numId w:val="3"/>
-        </w:numPr>
-        <w:rPr>
-          <w:lang w:val="id-ID"/>
-        </w:rPr>
-      </w:pPr>
-      <w:r>
-        <w:rPr>
-          <w:lang w:val="id-ID"/>
-        </w:rPr>
-        <w:t>Memverifikasi pembayaran.</w:t>
-      </w:r>
-    </w:p>
-    <w:p>
-      <w:pPr>
-        <w:pStyle w:val="ListParagraph"/>
-        <w:numPr>
-          <w:ilvl w:val="0"/>
-          <w:numId w:val="3"/>
-        </w:numPr>
-        <w:rPr>
-          <w:lang w:val="id-ID"/>
-        </w:rPr>
-      </w:pPr>
-      <w:r>
-        <w:rPr>
-          <w:lang w:val="id-ID"/>
-        </w:rPr>
-        <w:t>Mengelola pengumuman.</w:t>
       </w:r>
     </w:p>
     <w:p>
@@ -544,8 +646,25 @@
         <w:rPr>
           <w:lang w:val="id-ID"/>
         </w:rPr>
-        <w:lastRenderedPageBreak/>
-        <w:t xml:space="preserve">Aplikasi dibangun menggunakan </w:t>
+        <w:t xml:space="preserve">Aplikasi dikembangkan sebagai sistem berbasis web dengan menggunakan </w:t>
+      </w:r>
+      <w:proofErr w:type="spellStart"/>
+      <w:r>
+        <w:rPr>
+          <w:i/>
+          <w:iCs/>
+          <w:lang w:val="id-ID"/>
+        </w:rPr>
+        <w:t>framework</w:t>
+      </w:r>
+      <w:proofErr w:type="spellEnd"/>
+      <w:r>
+        <w:rPr>
+          <w:i/>
+          <w:iCs/>
+          <w:lang w:val="id-ID"/>
+        </w:rPr>
+        <w:t xml:space="preserve"> </w:t>
       </w:r>
       <w:proofErr w:type="spellStart"/>
       <w:r>
@@ -559,39 +678,185 @@
       <w:proofErr w:type="spellEnd"/>
       <w:r>
         <w:rPr>
-          <w:lang w:val="id-ID"/>
-        </w:rPr>
-        <w:t xml:space="preserve"> </w:t>
-      </w:r>
-      <w:r>
-        <w:rPr>
-          <w:i/>
-          <w:iCs/>
-          <w:lang w:val="id-ID"/>
-        </w:rPr>
-        <w:t>13</w:t>
-      </w:r>
-      <w:r>
-        <w:rPr>
-          <w:lang w:val="id-ID"/>
-        </w:rPr>
-        <w:t xml:space="preserve"> sehingga dapat diakses melalui berbagai web browser pada perangkat desktop maupun </w:t>
-      </w:r>
-      <w:proofErr w:type="spellStart"/>
-      <w:r>
-        <w:rPr>
-          <w:i/>
-          <w:iCs/>
-          <w:lang w:val="id-ID"/>
-        </w:rPr>
-        <w:t>smartphone</w:t>
-      </w:r>
-      <w:proofErr w:type="spellEnd"/>
+          <w:i/>
+          <w:iCs/>
+          <w:lang w:val="id-ID"/>
+        </w:rPr>
+        <w:t xml:space="preserve"> 13</w:t>
+      </w:r>
+      <w:r>
+        <w:rPr>
+          <w:lang w:val="id-ID"/>
+        </w:rPr>
+        <w:t xml:space="preserve"> dengan PHP 8.3 ke atas. Arsitektur yang digunakan adalah MVC (</w:t>
+      </w:r>
+      <w:r>
+        <w:rPr>
+          <w:i/>
+          <w:iCs/>
+          <w:lang w:val="id-ID"/>
+        </w:rPr>
+        <w:t>Model-View-</w:t>
+      </w:r>
+      <w:proofErr w:type="spellStart"/>
+      <w:r>
+        <w:rPr>
+          <w:i/>
+          <w:iCs/>
+          <w:lang w:val="id-ID"/>
+        </w:rPr>
+        <w:t>Controller</w:t>
+      </w:r>
+      <w:proofErr w:type="spellEnd"/>
+      <w:r>
+        <w:rPr>
+          <w:lang w:val="id-ID"/>
+        </w:rPr>
+        <w:t xml:space="preserve">) dengan </w:t>
+      </w:r>
+      <w:proofErr w:type="spellStart"/>
+      <w:r>
+        <w:rPr>
+          <w:i/>
+          <w:iCs/>
+          <w:lang w:val="id-ID"/>
+        </w:rPr>
+        <w:t>frontend</w:t>
+      </w:r>
+      <w:proofErr w:type="spellEnd"/>
+      <w:r>
+        <w:rPr>
+          <w:lang w:val="id-ID"/>
+        </w:rPr>
+        <w:t xml:space="preserve"> berupa </w:t>
+      </w:r>
+      <w:r>
+        <w:rPr>
+          <w:i/>
+          <w:iCs/>
+          <w:lang w:val="id-ID"/>
+        </w:rPr>
+        <w:t>HTML5</w:t>
+      </w:r>
+      <w:r>
+        <w:rPr>
+          <w:lang w:val="id-ID"/>
+        </w:rPr>
+        <w:t xml:space="preserve">, </w:t>
+      </w:r>
+      <w:r>
+        <w:rPr>
+          <w:i/>
+          <w:iCs/>
+          <w:lang w:val="id-ID"/>
+        </w:rPr>
+        <w:t>CSS3</w:t>
+      </w:r>
+      <w:r>
+        <w:rPr>
+          <w:lang w:val="id-ID"/>
+        </w:rPr>
+        <w:t xml:space="preserve">, </w:t>
+      </w:r>
+      <w:proofErr w:type="spellStart"/>
+      <w:r>
+        <w:rPr>
+          <w:i/>
+          <w:iCs/>
+          <w:lang w:val="id-ID"/>
+        </w:rPr>
+        <w:t>JavaScript</w:t>
+      </w:r>
+      <w:proofErr w:type="spellEnd"/>
+      <w:r>
+        <w:rPr>
+          <w:lang w:val="id-ID"/>
+        </w:rPr>
+        <w:t xml:space="preserve">, dan </w:t>
+      </w:r>
+      <w:proofErr w:type="spellStart"/>
+      <w:r>
+        <w:rPr>
+          <w:i/>
+          <w:iCs/>
+          <w:lang w:val="id-ID"/>
+        </w:rPr>
+        <w:t>Bootstrap</w:t>
+      </w:r>
+      <w:proofErr w:type="spellEnd"/>
+      <w:r>
+        <w:rPr>
+          <w:i/>
+          <w:iCs/>
+          <w:lang w:val="id-ID"/>
+        </w:rPr>
+        <w:t xml:space="preserve"> 5</w:t>
+      </w:r>
       <w:r>
         <w:rPr>
           <w:lang w:val="id-ID"/>
         </w:rPr>
         <w:t>.</w:t>
+      </w:r>
+    </w:p>
+    <w:p>
+      <w:pPr>
+        <w:ind w:left="851"/>
+        <w:rPr>
+          <w:lang w:val="id-ID"/>
+        </w:rPr>
+      </w:pPr>
+      <w:r>
+        <w:rPr>
+          <w:lang w:val="id-ID"/>
+        </w:rPr>
+        <w:t xml:space="preserve">Keunggulan berbasis web dibandingkan aplikasi desktop Visual Basic adalah akses dari mana saja dengan koneksi internet, </w:t>
+      </w:r>
+      <w:proofErr w:type="spellStart"/>
+      <w:r>
+        <w:rPr>
+          <w:i/>
+          <w:iCs/>
+          <w:lang w:val="id-ID"/>
+        </w:rPr>
+        <w:t>update</w:t>
+      </w:r>
+      <w:proofErr w:type="spellEnd"/>
+      <w:r>
+        <w:rPr>
+          <w:lang w:val="id-ID"/>
+        </w:rPr>
+        <w:t xml:space="preserve"> dan </w:t>
+      </w:r>
+      <w:proofErr w:type="spellStart"/>
+      <w:r>
+        <w:rPr>
+          <w:i/>
+          <w:iCs/>
+          <w:lang w:val="id-ID"/>
+        </w:rPr>
+        <w:t>maintenance</w:t>
+      </w:r>
+      <w:proofErr w:type="spellEnd"/>
+      <w:r>
+        <w:rPr>
+          <w:lang w:val="id-ID"/>
+        </w:rPr>
+        <w:t xml:space="preserve"> terpusat di server, tidak perlu instalasi di setiap komputer, </w:t>
+      </w:r>
+      <w:proofErr w:type="spellStart"/>
+      <w:r>
+        <w:rPr>
+          <w:lang w:val="id-ID"/>
+        </w:rPr>
+        <w:t>skalabilitas</w:t>
+      </w:r>
+      <w:proofErr w:type="spellEnd"/>
+      <w:r>
+        <w:rPr>
+          <w:lang w:val="id-ID"/>
+        </w:rPr>
+        <w:t xml:space="preserve"> yang lebih baik, dan keamanan yang lebih terjamin.</w:t>
       </w:r>
     </w:p>
     <w:p>
@@ -733,6 +998,7 @@
         <w:rPr>
           <w:lang w:val="id-ID"/>
         </w:rPr>
+        <w:lastRenderedPageBreak/>
         <w:t>Keamanan Sistem</w:t>
       </w:r>
     </w:p>

</xml_diff>